<commit_message>
fix: perbarui tautan profil LinkedIn ke https://www.linkedin.com/in/reihan-mutaqin-351169201/
</commit_message>
<xml_diff>
--- a/public/downloads/CV-ATS-Reihan-Mutaqin.docx
+++ b/public/downloads/CV-ATS-Reihan-Mutaqin.docx
@@ -46,7 +46,7 @@
           <w:color w:val="5A5A5A"/>
           <w:sz w:val="17"/>
         </w:rPr>
-        <w:t>Pandeglang, Banten  |  +62 821 1103 9958  |  reyhanmutakin1@gmail.com  |  linkedin.com/in/reihanmutaqin  |  github.com/ReihanMutaqin</w:t>
+        <w:t>Pandeglang, Banten  |  +62 821 1103 9958  |  reyhanmutakin1@gmail.com  |  linkedin.com/in/reihan-mutaqin-351169201  |  github.com/ReihanMutaqin</w:t>
       </w:r>
     </w:p>
     <w:p>
@@ -961,31 +961,31 @@
       </w:rPr>
     </w:lvl>
   </w:abstractNum>
-  <w:num w:numId="1" w16cid:durableId="2146964974">
+  <w:num w:numId="1" w16cid:durableId="1911428082">
     <w:abstractNumId w:val="8"/>
   </w:num>
-  <w:num w:numId="2" w16cid:durableId="696006082">
+  <w:num w:numId="2" w16cid:durableId="1911110186">
     <w:abstractNumId w:val="6"/>
   </w:num>
-  <w:num w:numId="3" w16cid:durableId="17051753">
+  <w:num w:numId="3" w16cid:durableId="1908606368">
     <w:abstractNumId w:val="5"/>
   </w:num>
-  <w:num w:numId="4" w16cid:durableId="1599025398">
+  <w:num w:numId="4" w16cid:durableId="30889428">
     <w:abstractNumId w:val="4"/>
   </w:num>
-  <w:num w:numId="5" w16cid:durableId="185950228">
+  <w:num w:numId="5" w16cid:durableId="1651396709">
     <w:abstractNumId w:val="7"/>
   </w:num>
-  <w:num w:numId="6" w16cid:durableId="2102557125">
+  <w:num w:numId="6" w16cid:durableId="1389647318">
     <w:abstractNumId w:val="3"/>
   </w:num>
-  <w:num w:numId="7" w16cid:durableId="700014598">
+  <w:num w:numId="7" w16cid:durableId="523253833">
     <w:abstractNumId w:val="2"/>
   </w:num>
-  <w:num w:numId="8" w16cid:durableId="1210457794">
+  <w:num w:numId="8" w16cid:durableId="1184200243">
     <w:abstractNumId w:val="1"/>
   </w:num>
-  <w:num w:numId="9" w16cid:durableId="1376539088">
+  <w:num w:numId="9" w16cid:durableId="246889870">
     <w:abstractNumId w:val="0"/>
   </w:num>
 </w:numbering>

</xml_diff>

<commit_message>
refactor(cv): perbarui tata letak CV ATS monokrom standar eksekutif yang natural dan rapi 1 halaman
</commit_message>
<xml_diff>
--- a/public/downloads/CV-ATS-Reihan-Mutaqin.docx
+++ b/public/downloads/CV-ATS-Reihan-Mutaqin.docx
@@ -2,22 +2,6 @@
 <file path=word/document.xml><?xml version="1.0" encoding="utf-8"?>
 <w:document xmlns:wpc="http://schemas.microsoft.com/office/word/2010/wordprocessingCanvas" xmlns:cx="http://schemas.microsoft.com/office/drawing/2014/chartex" xmlns:cx1="http://schemas.microsoft.com/office/drawing/2015/9/8/chartex" xmlns:cx2="http://schemas.microsoft.com/office/drawing/2015/10/21/chartex" xmlns:cx3="http://schemas.microsoft.com/office/drawing/2016/5/9/chartex" xmlns:cx4="http://schemas.microsoft.com/office/drawing/2016/5/10/chartex" xmlns:cx5="http://schemas.microsoft.com/office/drawing/2016/5/11/chartex" xmlns:cx6="http://schemas.microsoft.com/office/drawing/2016/5/12/chartex" xmlns:cx7="http://schemas.microsoft.com/office/drawing/2016/5/13/chartex" xmlns:cx8="http://schemas.microsoft.com/office/drawing/2016/5/14/chartex" xmlns:mc="http://schemas.openxmlformats.org/markup-compatibility/2006" xmlns:aink="http://schemas.microsoft.com/office/drawing/2016/ink" xmlns:am3d="http://schemas.microsoft.com/office/drawing/2017/model3d" xmlns:o="urn:schemas-microsoft-com:office:office" xmlns:oel="http://schemas.microsoft.com/office/2019/extlst" xmlns:r="http://schemas.openxmlformats.org/officeDocument/2006/relationships" xmlns:m="http://schemas.openxmlformats.org/officeDocument/2006/math" xmlns:v="urn:schemas-microsoft-com:vml" xmlns:wp14="http://schemas.microsoft.com/office/word/2010/wordprocessingDrawing" xmlns:wp="http://schemas.openxmlformats.org/drawingml/2006/wordprocessingDrawing" xmlns:w10="urn:schemas-microsoft-com:office:word" xmlns:w="http://schemas.openxmlformats.org/wordprocessingml/2006/main" xmlns:w14="http://schemas.microsoft.com/office/word/2010/wordml" xmlns:w15="http://schemas.microsoft.com/office/word/2012/wordml" xmlns:w16cex="http://schemas.microsoft.com/office/word/2018/wordml/cex" xmlns:w16cid="http://schemas.microsoft.com/office/word/2016/wordml/cid" xmlns:w16="http://schemas.microsoft.com/office/word/2018/wordml" xmlns:w16du="http://schemas.microsoft.com/office/word/2023/wordml/word16du" xmlns:w16sdtdh="http://schemas.microsoft.com/office/word/2020/wordml/sdtdatahash" xmlns:w16sdtfl="http://schemas.microsoft.com/office/word/2024/wordml/sdtformatlock" xmlns:w16se="http://schemas.microsoft.com/office/word/2015/wordml/symex" xmlns:wpg="http://schemas.microsoft.com/office/word/2010/wordprocessingGroup" xmlns:wpi="http://schemas.microsoft.com/office/word/2010/wordprocessingInk" xmlns:wne="http://schemas.microsoft.com/office/word/2006/wordml" xmlns:wps="http://schemas.microsoft.com/office/word/2010/wordprocessingShape" mc:Ignorable="w14 w15 w16se w16cid w16 w16cex w16sdtdh w16sdtfl w16du wp14">
   <w:body>
-    <w:p>
-      <w:pPr>
-        <w:keepNext/>
-        <w:spacing w:after="30"/>
-        <w:jc w:val="center"/>
-      </w:pPr>
-      <w:r>
-        <w:rPr>
-          <w:rFonts w:ascii="Calibri" w:eastAsia="Calibri" w:hAnsi="Calibri"/>
-          <w:b/>
-          <w:color w:val="1E1E1E"/>
-          <w:sz w:val="36"/>
-        </w:rPr>
-        <w:t>REIHAN MUTAQIN</w:t>
-      </w:r>
-    </w:p>
     <w:p>
       <w:pPr>
         <w:keepNext/>
@@ -28,10 +12,10 @@
         <w:rPr>
           <w:rFonts w:ascii="Calibri" w:eastAsia="Calibri" w:hAnsi="Calibri"/>
           <w:b/>
-          <w:color w:val="18416E"/>
-          <w:sz w:val="19"/>
+          <w:color w:val="111827"/>
+          <w:sz w:val="36"/>
         </w:rPr>
-        <w:t>Operasional TI · Software &amp; Web Development · Edukasi Informatika</w:t>
+        <w:t>REIHAN MUTAQIN</w:t>
       </w:r>
     </w:p>
     <w:p>
@@ -43,56 +27,41 @@
       <w:r>
         <w:rPr>
           <w:rFonts w:ascii="Calibri" w:eastAsia="Calibri" w:hAnsi="Calibri"/>
-          <w:color w:val="5A5A5A"/>
-          <w:sz w:val="17"/>
+          <w:color w:val="1F2937"/>
+          <w:sz w:val="18"/>
         </w:rPr>
-        <w:t>Pandeglang, Banten  |  +62 821 1103 9958  |  reyhanmutakin1@gmail.com  |  linkedin.com/in/reihan-mutaqin-351169201  |  github.com/ReihanMutaqin</w:t>
+        <w:t>Pandeglang, Banten  •  0821-1103-9958  •  reyhanmutakin1@gmail.com</w:t>
+      </w:r>
+      <w:r>
+        <w:rPr>
+          <w:rFonts w:ascii="Calibri" w:eastAsia="Calibri" w:hAnsi="Calibri"/>
+          <w:color w:val="1F2937"/>
+          <w:sz w:val="18"/>
+        </w:rPr>
+        <w:br/>
+      </w:r>
+      <w:r>
+        <w:rPr>
+          <w:rFonts w:ascii="Calibri" w:eastAsia="Calibri" w:hAnsi="Calibri"/>
+          <w:color w:val="4B5563"/>
+          <w:sz w:val="18"/>
+        </w:rPr>
+        <w:t>linkedin.com/in/reihan-mutaqin-351169201  •  github.com/ReihanMutaqin</w:t>
       </w:r>
     </w:p>
     <w:p>
       <w:pPr>
         <w:keepNext/>
         <w:pBdr>
-          <w:bottom w:val="single" w:sz="6" w:space="1" w:color="18416E"/>
+          <w:bottom w:val="single" w:sz="8" w:space="2" w:color="1F2937"/>
         </w:pBdr>
-        <w:spacing w:before="110" w:after="50" w:line="240" w:lineRule="auto"/>
+        <w:spacing w:before="170" w:after="70" w:line="240" w:lineRule="auto"/>
       </w:pPr>
       <w:r>
         <w:rPr>
           <w:rFonts w:ascii="Calibri" w:eastAsia="Calibri" w:hAnsi="Calibri"/>
           <w:b/>
-          <w:color w:val="18416E"/>
-          <w:sz w:val="21"/>
-        </w:rPr>
-        <w:t>RINGKASAN PROFESIONAL</w:t>
-      </w:r>
-    </w:p>
-    <w:p>
-      <w:pPr>
-        <w:spacing w:after="60" w:line="259" w:lineRule="auto"/>
-      </w:pPr>
-      <w:r>
-        <w:rPr>
-          <w:rFonts w:ascii="Calibri" w:eastAsia="Calibri" w:hAnsi="Calibri"/>
-          <w:color w:val="1E1E1E"/>
-          <w:sz w:val="19"/>
-        </w:rPr>
-        <w:t>Lulusan S1 Pendidikan Teknologi Informasi (IPK 3,96/4,00 - Lulusan Terbaik) dengan kombinasi pengalaman di operasional data layanan telekomunikasi, pengembangan perangkat lunak (Unity, C#, Web), dan pengajaran informatika. Terbiasa melakukan rekonsiliasi data, pemantauan sistem, dan penyusunan laporan operasional secara terstruktur, teliti, dan berorientasi hasil.</w:t>
-      </w:r>
-    </w:p>
-    <w:p>
-      <w:pPr>
-        <w:keepNext/>
-        <w:pBdr>
-          <w:bottom w:val="single" w:sz="6" w:space="1" w:color="18416E"/>
-        </w:pBdr>
-        <w:spacing w:before="110" w:after="50" w:line="240" w:lineRule="auto"/>
-      </w:pPr>
-      <w:r>
-        <w:rPr>
-          <w:rFonts w:ascii="Calibri" w:eastAsia="Calibri" w:hAnsi="Calibri"/>
-          <w:b/>
-          <w:color w:val="18416E"/>
+          <w:color w:val="111827"/>
           <w:sz w:val="21"/>
         </w:rPr>
         <w:t>PENGALAMAN KERJA</w:t>
@@ -101,47 +70,59 @@
     <w:p>
       <w:pPr>
         <w:keepNext/>
-        <w:spacing w:before="60" w:after="20" w:line="252" w:lineRule="auto"/>
+        <w:tabs>
+          <w:tab w:val="right" w:pos="10469"/>
+        </w:tabs>
+        <w:spacing w:before="80" w:after="30" w:line="252" w:lineRule="auto"/>
       </w:pPr>
       <w:r>
         <w:rPr>
           <w:rFonts w:ascii="Calibri" w:eastAsia="Calibri" w:hAnsi="Calibri"/>
           <w:b/>
-          <w:color w:val="1E1E1E"/>
+          <w:color w:val="111827"/>
+          <w:sz w:val="20"/>
+        </w:rPr>
+        <w:t>PT Telkom Indonesia</w:t>
+      </w:r>
+      <w:r>
+        <w:rPr>
+          <w:rFonts w:ascii="Calibri" w:eastAsia="Calibri" w:hAnsi="Calibri"/>
+          <w:color w:val="4B5563"/>
           <w:sz w:val="19"/>
         </w:rPr>
-        <w:t>Agent (Operasional Data &amp; Layanan)</w:t>
+        <w:t xml:space="preserve">  —  </w:t>
+      </w:r>
+      <w:r>
+        <w:rPr>
+          <w:rFonts w:ascii="Calibri" w:eastAsia="Calibri" w:hAnsi="Calibri"/>
+          <w:i/>
+          <w:color w:val="1F2937"/>
+          <w:sz w:val="19"/>
+        </w:rPr>
+        <w:t>Agent Operasional Data &amp; Layanan</w:t>
       </w:r>
       <w:r>
         <w:rPr>
           <w:rFonts w:ascii="Calibri" w:eastAsia="Calibri" w:hAnsi="Calibri"/>
           <w:b/>
-          <w:color w:val="18416E"/>
-          <w:sz w:val="19"/>
-        </w:rPr>
-        <w:t xml:space="preserve"> | PT Telkom Indonesia</w:t>
-      </w:r>
-      <w:r>
-        <w:rPr>
-          <w:rFonts w:ascii="Calibri" w:eastAsia="Calibri" w:hAnsi="Calibri"/>
-          <w:i/>
-          <w:color w:val="5A5A5A"/>
+          <w:color w:val="1F2937"/>
           <w:sz w:val="18"/>
         </w:rPr>
-        <w:t xml:space="preserve"> — Nov 2025 – Sekarang</w:t>
+        <w:tab/>
+        <w:t>Nov 2025 – Sekarang</w:t>
       </w:r>
     </w:p>
     <w:p>
       <w:pPr>
         <w:keepLines/>
-        <w:spacing w:after="30" w:line="252" w:lineRule="auto"/>
+        <w:spacing w:after="44" w:line="269" w:lineRule="auto"/>
         <w:ind w:left="259"/>
       </w:pPr>
       <w:r>
         <w:rPr>
           <w:rFonts w:ascii="Calibri" w:eastAsia="Calibri" w:hAnsi="Calibri"/>
           <w:b/>
-          <w:color w:val="18416E"/>
+          <w:color w:val="111827"/>
           <w:sz w:val="19"/>
         </w:rPr>
         <w:t xml:space="preserve">•  </w:t>
@@ -149,23 +130,23 @@
       <w:r>
         <w:rPr>
           <w:rFonts w:ascii="Calibri" w:eastAsia="Calibri" w:hAnsi="Calibri"/>
-          <w:color w:val="1E1E1E"/>
+          <w:color w:val="1F2937"/>
           <w:sz w:val="19"/>
         </w:rPr>
-        <w:t>Merekonsiliasi data jaringan dan layanan pelanggan pada sistem UIM untuk memastikan akurasi data operasional.</w:t>
+        <w:t>Merekonsiliasi data inventori jaringan dan data pelanggan pada sistem UIM untuk memastikan akurasi data teknis.</w:t>
       </w:r>
     </w:p>
     <w:p>
       <w:pPr>
         <w:keepLines/>
-        <w:spacing w:after="30" w:line="252" w:lineRule="auto"/>
+        <w:spacing w:after="44" w:line="269" w:lineRule="auto"/>
         <w:ind w:left="259"/>
       </w:pPr>
       <w:r>
         <w:rPr>
           <w:rFonts w:ascii="Calibri" w:eastAsia="Calibri" w:hAnsi="Calibri"/>
           <w:b/>
-          <w:color w:val="18416E"/>
+          <w:color w:val="111827"/>
           <w:sz w:val="19"/>
         </w:rPr>
         <w:t xml:space="preserve">•  </w:t>
@@ -173,23 +154,23 @@
       <w:r>
         <w:rPr>
           <w:rFonts w:ascii="Calibri" w:eastAsia="Calibri" w:hAnsi="Calibri"/>
-          <w:color w:val="1E1E1E"/>
+          <w:color w:val="1F2937"/>
           <w:sz w:val="19"/>
         </w:rPr>
-        <w:t>Memantau alur order dan eskalasi tiket layanan melalui alur kerja WOC, organic, C4, GDoc, dan ROC.</w:t>
+        <w:t>Memonitor order layanan baru dan menindaklanjuti progres tiket gangguan melalui alur kerja WOC, Organic, C4, GDoc, dan ROC.</w:t>
       </w:r>
     </w:p>
     <w:p>
       <w:pPr>
         <w:keepLines/>
-        <w:spacing w:after="30" w:line="252" w:lineRule="auto"/>
+        <w:spacing w:after="44" w:line="269" w:lineRule="auto"/>
         <w:ind w:left="259"/>
       </w:pPr>
       <w:r>
         <w:rPr>
           <w:rFonts w:ascii="Calibri" w:eastAsia="Calibri" w:hAnsi="Calibri"/>
           <w:b/>
-          <w:color w:val="18416E"/>
+          <w:color w:val="111827"/>
           <w:sz w:val="19"/>
         </w:rPr>
         <w:t xml:space="preserve">•  </w:t>
@@ -197,56 +178,68 @@
       <w:r>
         <w:rPr>
           <w:rFonts w:ascii="Calibri" w:eastAsia="Calibri" w:hAnsi="Calibri"/>
-          <w:color w:val="1E1E1E"/>
+          <w:color w:val="1F2937"/>
           <w:sz w:val="19"/>
         </w:rPr>
-        <w:t>Menyusun laporan operasional progres pekerjaan serta berkoordinasi lintas tim dalam penyelesaian kendala teknis.</w:t>
+        <w:t>Menyusun rekapitulasi laporan operasional harian dan berkoordinasi dengan tim teknis terkait penanganan kendala.</w:t>
       </w:r>
     </w:p>
     <w:p>
       <w:pPr>
         <w:keepNext/>
-        <w:spacing w:before="60" w:after="20" w:line="252" w:lineRule="auto"/>
+        <w:tabs>
+          <w:tab w:val="right" w:pos="10469"/>
+        </w:tabs>
+        <w:spacing w:before="80" w:after="30" w:line="252" w:lineRule="auto"/>
       </w:pPr>
       <w:r>
         <w:rPr>
           <w:rFonts w:ascii="Calibri" w:eastAsia="Calibri" w:hAnsi="Calibri"/>
           <w:b/>
-          <w:color w:val="1E1E1E"/>
+          <w:color w:val="111827"/>
+          <w:sz w:val="20"/>
+        </w:rPr>
+        <w:t>Freelance Developer</w:t>
+      </w:r>
+      <w:r>
+        <w:rPr>
+          <w:rFonts w:ascii="Calibri" w:eastAsia="Calibri" w:hAnsi="Calibri"/>
+          <w:color w:val="4B5563"/>
           <w:sz w:val="19"/>
         </w:rPr>
-        <w:t>Pengembang Web, Game &amp; Aplikasi (Freelance)</w:t>
+        <w:t xml:space="preserve">  —  </w:t>
+      </w:r>
+      <w:r>
+        <w:rPr>
+          <w:rFonts w:ascii="Calibri" w:eastAsia="Calibri" w:hAnsi="Calibri"/>
+          <w:i/>
+          <w:color w:val="1F2937"/>
+          <w:sz w:val="19"/>
+        </w:rPr>
+        <w:t>Pengembang Web, Game &amp; Aplikasi</w:t>
       </w:r>
       <w:r>
         <w:rPr>
           <w:rFonts w:ascii="Calibri" w:eastAsia="Calibri" w:hAnsi="Calibri"/>
           <w:b/>
-          <w:color w:val="18416E"/>
-          <w:sz w:val="19"/>
-        </w:rPr>
-        <w:t xml:space="preserve"> | Proyek Klien</w:t>
-      </w:r>
-      <w:r>
-        <w:rPr>
-          <w:rFonts w:ascii="Calibri" w:eastAsia="Calibri" w:hAnsi="Calibri"/>
-          <w:i/>
-          <w:color w:val="5A5A5A"/>
+          <w:color w:val="1F2937"/>
           <w:sz w:val="18"/>
         </w:rPr>
-        <w:t xml:space="preserve"> — Okt 2022 – Sekarang</w:t>
+        <w:tab/>
+        <w:t>Okt 2022 – Sekarang</w:t>
       </w:r>
     </w:p>
     <w:p>
       <w:pPr>
         <w:keepLines/>
-        <w:spacing w:after="30" w:line="252" w:lineRule="auto"/>
+        <w:spacing w:after="44" w:line="269" w:lineRule="auto"/>
         <w:ind w:left="259"/>
       </w:pPr>
       <w:r>
         <w:rPr>
           <w:rFonts w:ascii="Calibri" w:eastAsia="Calibri" w:hAnsi="Calibri"/>
           <w:b/>
-          <w:color w:val="18416E"/>
+          <w:color w:val="111827"/>
           <w:sz w:val="19"/>
         </w:rPr>
         <w:t xml:space="preserve">•  </w:t>
@@ -254,23 +247,23 @@
       <w:r>
         <w:rPr>
           <w:rFonts w:ascii="Calibri" w:eastAsia="Calibri" w:hAnsi="Calibri"/>
-          <w:color w:val="1E1E1E"/>
+          <w:color w:val="1F2937"/>
           <w:sz w:val="19"/>
         </w:rPr>
-        <w:t>Mengembangkan aplikasi interaktif, game edukasi 3D, dan modul Augmented Reality (AR) berbasis Unity (C#) dan Vuforia.</w:t>
+        <w:t>Mengembangkan aplikasi interaktif dan modul Augmented Reality (AR) berbasis Unity (C#) dan Vuforia sesuai kebutuhan klien.</w:t>
       </w:r>
     </w:p>
     <w:p>
       <w:pPr>
         <w:keepLines/>
-        <w:spacing w:after="30" w:line="252" w:lineRule="auto"/>
+        <w:spacing w:after="44" w:line="269" w:lineRule="auto"/>
         <w:ind w:left="259"/>
       </w:pPr>
       <w:r>
         <w:rPr>
           <w:rFonts w:ascii="Calibri" w:eastAsia="Calibri" w:hAnsi="Calibri"/>
           <w:b/>
-          <w:color w:val="18416E"/>
+          <w:color w:val="111827"/>
           <w:sz w:val="19"/>
         </w:rPr>
         <w:t xml:space="preserve">•  </w:t>
@@ -278,23 +271,23 @@
       <w:r>
         <w:rPr>
           <w:rFonts w:ascii="Calibri" w:eastAsia="Calibri" w:hAnsi="Calibri"/>
-          <w:color w:val="1E1E1E"/>
+          <w:color w:val="1F2937"/>
           <w:sz w:val="19"/>
         </w:rPr>
-        <w:t>Membangun website profil responsif, portal berita dinamis, dan platform e-commerce dengan sistem manajemen konten (CMS).</w:t>
+        <w:t>Membangun website profil instansi, portal berita dinamis, dan toko online berbasis CMS, PHP, JavaScript, serta basis data MySQL.</w:t>
       </w:r>
     </w:p>
     <w:p>
       <w:pPr>
         <w:keepLines/>
-        <w:spacing w:after="30" w:line="252" w:lineRule="auto"/>
+        <w:spacing w:after="44" w:line="269" w:lineRule="auto"/>
         <w:ind w:left="259"/>
       </w:pPr>
       <w:r>
         <w:rPr>
           <w:rFonts w:ascii="Calibri" w:eastAsia="Calibri" w:hAnsi="Calibri"/>
           <w:b/>
-          <w:color w:val="18416E"/>
+          <w:color w:val="111827"/>
           <w:sz w:val="19"/>
         </w:rPr>
         <w:t xml:space="preserve">•  </w:t>
@@ -302,22 +295,42 @@
       <w:r>
         <w:rPr>
           <w:rFonts w:ascii="Calibri" w:eastAsia="Calibri" w:hAnsi="Calibri"/>
-          <w:color w:val="1E1E1E"/>
+          <w:color w:val="1F2937"/>
           <w:sz w:val="19"/>
         </w:rPr>
-        <w:t>Mengelola siklus pengembangan proyek: analisis kebutuhan klien, perancangan UI/UX, pengkodean, pengujian, hingga deployment.</w:t>
+        <w:t>Mengelola komunikasi teknis dengan klien mulai dari analisis kebutuhan, implementasi fitur, pengujian, hingga serah terima.</w:t>
       </w:r>
     </w:p>
     <w:p>
       <w:pPr>
         <w:keepNext/>
-        <w:spacing w:before="60" w:after="20" w:line="252" w:lineRule="auto"/>
+        <w:tabs>
+          <w:tab w:val="right" w:pos="10469"/>
+        </w:tabs>
+        <w:spacing w:before="80" w:after="30" w:line="252" w:lineRule="auto"/>
       </w:pPr>
       <w:r>
         <w:rPr>
           <w:rFonts w:ascii="Calibri" w:eastAsia="Calibri" w:hAnsi="Calibri"/>
           <w:b/>
-          <w:color w:val="1E1E1E"/>
+          <w:color w:val="111827"/>
+          <w:sz w:val="20"/>
+        </w:rPr>
+        <w:t>Ganesha Operation</w:t>
+      </w:r>
+      <w:r>
+        <w:rPr>
+          <w:rFonts w:ascii="Calibri" w:eastAsia="Calibri" w:hAnsi="Calibri"/>
+          <w:color w:val="4B5563"/>
+          <w:sz w:val="19"/>
+        </w:rPr>
+        <w:t xml:space="preserve">  —  </w:t>
+      </w:r>
+      <w:r>
+        <w:rPr>
+          <w:rFonts w:ascii="Calibri" w:eastAsia="Calibri" w:hAnsi="Calibri"/>
+          <w:i/>
+          <w:color w:val="1F2937"/>
           <w:sz w:val="19"/>
         </w:rPr>
         <w:t>Pengajar Informatika</w:t>
@@ -326,32 +339,24 @@
         <w:rPr>
           <w:rFonts w:ascii="Calibri" w:eastAsia="Calibri" w:hAnsi="Calibri"/>
           <w:b/>
-          <w:color w:val="18416E"/>
-          <w:sz w:val="19"/>
-        </w:rPr>
-        <w:t xml:space="preserve"> | Ganesha Operation</w:t>
-      </w:r>
-      <w:r>
-        <w:rPr>
-          <w:rFonts w:ascii="Calibri" w:eastAsia="Calibri" w:hAnsi="Calibri"/>
-          <w:i/>
-          <w:color w:val="5A5A5A"/>
+          <w:color w:val="1F2937"/>
           <w:sz w:val="18"/>
         </w:rPr>
-        <w:t xml:space="preserve"> — Jul 2025 – Des 2025</w:t>
+        <w:tab/>
+        <w:t>Jul 2025 – Des 2025</w:t>
       </w:r>
     </w:p>
     <w:p>
       <w:pPr>
         <w:keepLines/>
-        <w:spacing w:after="30" w:line="252" w:lineRule="auto"/>
+        <w:spacing w:after="44" w:line="269" w:lineRule="auto"/>
         <w:ind w:left="259"/>
       </w:pPr>
       <w:r>
         <w:rPr>
           <w:rFonts w:ascii="Calibri" w:eastAsia="Calibri" w:hAnsi="Calibri"/>
           <w:b/>
-          <w:color w:val="18416E"/>
+          <w:color w:val="111827"/>
           <w:sz w:val="19"/>
         </w:rPr>
         <w:t xml:space="preserve">•  </w:t>
@@ -359,56 +364,68 @@
       <w:r>
         <w:rPr>
           <w:rFonts w:ascii="Calibri" w:eastAsia="Calibri" w:hAnsi="Calibri"/>
-          <w:color w:val="1E1E1E"/>
+          <w:color w:val="1F2937"/>
           <w:sz w:val="19"/>
         </w:rPr>
-        <w:t>Mengajarkan konsep dasar pemrograman, algoritma logika, dan mendampingi praktik komputer interaktif bagi siswa.</w:t>
+        <w:t>Mengajar materi informatika dasar, logika berpikir pemrograman, dan membimbing sesi praktik komputer bagi siswa.</w:t>
       </w:r>
     </w:p>
     <w:p>
       <w:pPr>
         <w:keepNext/>
-        <w:spacing w:before="60" w:after="20" w:line="252" w:lineRule="auto"/>
+        <w:tabs>
+          <w:tab w:val="right" w:pos="10469"/>
+        </w:tabs>
+        <w:spacing w:before="80" w:after="30" w:line="252" w:lineRule="auto"/>
       </w:pPr>
       <w:r>
         <w:rPr>
           <w:rFonts w:ascii="Calibri" w:eastAsia="Calibri" w:hAnsi="Calibri"/>
           <w:b/>
-          <w:color w:val="1E1E1E"/>
+          <w:color w:val="111827"/>
+          <w:sz w:val="20"/>
+        </w:rPr>
+        <w:t>SMKN 1 Pandeglang</w:t>
+      </w:r>
+      <w:r>
+        <w:rPr>
+          <w:rFonts w:ascii="Calibri" w:eastAsia="Calibri" w:hAnsi="Calibri"/>
+          <w:color w:val="4B5563"/>
           <w:sz w:val="19"/>
         </w:rPr>
-        <w:t>Pengajar Magang Informatika</w:t>
+        <w:t xml:space="preserve">  —  </w:t>
+      </w:r>
+      <w:r>
+        <w:rPr>
+          <w:rFonts w:ascii="Calibri" w:eastAsia="Calibri" w:hAnsi="Calibri"/>
+          <w:i/>
+          <w:color w:val="1F2937"/>
+          <w:sz w:val="19"/>
+        </w:rPr>
+        <w:t>Guru Praktik Magang Informatika</w:t>
       </w:r>
       <w:r>
         <w:rPr>
           <w:rFonts w:ascii="Calibri" w:eastAsia="Calibri" w:hAnsi="Calibri"/>
           <w:b/>
-          <w:color w:val="18416E"/>
-          <w:sz w:val="19"/>
-        </w:rPr>
-        <w:t xml:space="preserve"> | SMKN 1 Pandeglang</w:t>
-      </w:r>
-      <w:r>
-        <w:rPr>
-          <w:rFonts w:ascii="Calibri" w:eastAsia="Calibri" w:hAnsi="Calibri"/>
-          <w:i/>
-          <w:color w:val="5A5A5A"/>
+          <w:color w:val="1F2937"/>
           <w:sz w:val="18"/>
         </w:rPr>
-        <w:t xml:space="preserve"> — Feb 2024 – Mar 2024</w:t>
+        <w:tab/>
+        <w:t>Feb 2024 – Mar 2024</w:t>
       </w:r>
     </w:p>
     <w:p>
       <w:pPr>
         <w:keepLines/>
-        <w:spacing w:after="30" w:line="252" w:lineRule="auto"/>
+        <w:spacing w:after="44" w:line="269" w:lineRule="auto"/>
         <w:ind w:left="259"/>
       </w:pPr>
       <w:r>
         <w:rPr>
           <w:rFonts w:ascii="Calibri" w:eastAsia="Calibri" w:hAnsi="Calibri"/>
           <w:b/>
-          <w:color w:val="18416E"/>
+          <w:color w:val="111827"/>
           <w:sz w:val="19"/>
         </w:rPr>
         <w:t xml:space="preserve">•  </w:t>
@@ -416,40 +433,129 @@
       <w:r>
         <w:rPr>
           <w:rFonts w:ascii="Calibri" w:eastAsia="Calibri" w:hAnsi="Calibri"/>
-          <w:color w:val="1E1E1E"/>
+          <w:color w:val="1F2937"/>
           <w:sz w:val="19"/>
         </w:rPr>
-        <w:t>Menyusun modul ajar kejuruan dan mengampu kegiatan pembelajaran praktik laboratorium komputer untuk 2+ kelas.</w:t>
+        <w:t>Menyusun modul ajar kejuruan dan mengampu kegiatan pembelajaran praktik laboratorium komputer untuk 2 kelas.</w:t>
+      </w:r>
+    </w:p>
+    <w:p>
+      <w:pPr>
+        <w:keepNext/>
+        <w:tabs>
+          <w:tab w:val="right" w:pos="10469"/>
+        </w:tabs>
+        <w:spacing w:before="80" w:after="30" w:line="252" w:lineRule="auto"/>
+      </w:pPr>
+      <w:r>
+        <w:rPr>
+          <w:rFonts w:ascii="Calibri" w:eastAsia="Calibri" w:hAnsi="Calibri"/>
+          <w:b/>
+          <w:color w:val="111827"/>
+          <w:sz w:val="20"/>
+        </w:rPr>
+        <w:t>Diskominfo Kab. Pandeglang</w:t>
+      </w:r>
+      <w:r>
+        <w:rPr>
+          <w:rFonts w:ascii="Calibri" w:eastAsia="Calibri" w:hAnsi="Calibri"/>
+          <w:color w:val="4B5563"/>
+          <w:sz w:val="19"/>
+        </w:rPr>
+        <w:t xml:space="preserve">  —  </w:t>
+      </w:r>
+      <w:r>
+        <w:rPr>
+          <w:rFonts w:ascii="Calibri" w:eastAsia="Calibri" w:hAnsi="Calibri"/>
+          <w:i/>
+          <w:color w:val="1F2937"/>
+          <w:sz w:val="19"/>
+        </w:rPr>
+        <w:t>Magang Divisi Media &amp; TI</w:t>
+      </w:r>
+      <w:r>
+        <w:rPr>
+          <w:rFonts w:ascii="Calibri" w:eastAsia="Calibri" w:hAnsi="Calibri"/>
+          <w:b/>
+          <w:color w:val="1F2937"/>
+          <w:sz w:val="18"/>
+        </w:rPr>
+        <w:tab/>
+        <w:t>Jul 2019 – Sep 2019</w:t>
+      </w:r>
+    </w:p>
+    <w:p>
+      <w:pPr>
+        <w:keepLines/>
+        <w:spacing w:after="44" w:line="269" w:lineRule="auto"/>
+        <w:ind w:left="259"/>
+      </w:pPr>
+      <w:r>
+        <w:rPr>
+          <w:rFonts w:ascii="Calibri" w:eastAsia="Calibri" w:hAnsi="Calibri"/>
+          <w:b/>
+          <w:color w:val="111827"/>
+          <w:sz w:val="19"/>
+        </w:rPr>
+        <w:t xml:space="preserve">•  </w:t>
+      </w:r>
+      <w:r>
+        <w:rPr>
+          <w:rFonts w:ascii="Calibri" w:eastAsia="Calibri" w:hAnsi="Calibri"/>
+          <w:color w:val="1F2937"/>
+          <w:sz w:val="19"/>
+        </w:rPr>
+        <w:t>Membantu pengelolaan konten website resmi, monitoring fasilitas Gedung Pintar, dan dokumentasi kegiatan instansi.</w:t>
       </w:r>
     </w:p>
     <w:p>
       <w:pPr>
         <w:keepNext/>
         <w:pBdr>
-          <w:bottom w:val="single" w:sz="6" w:space="1" w:color="18416E"/>
+          <w:bottom w:val="single" w:sz="8" w:space="2" w:color="1F2937"/>
         </w:pBdr>
-        <w:spacing w:before="110" w:after="50" w:line="240" w:lineRule="auto"/>
+        <w:spacing w:before="170" w:after="70" w:line="240" w:lineRule="auto"/>
       </w:pPr>
       <w:r>
         <w:rPr>
           <w:rFonts w:ascii="Calibri" w:eastAsia="Calibri" w:hAnsi="Calibri"/>
           <w:b/>
-          <w:color w:val="18416E"/>
+          <w:color w:val="111827"/>
           <w:sz w:val="21"/>
         </w:rPr>
-        <w:t>PENDIDIKAN &amp; PRESTASI</w:t>
+        <w:t>PENDIDIKAN</w:t>
       </w:r>
     </w:p>
     <w:p>
       <w:pPr>
         <w:keepNext/>
-        <w:spacing w:before="50" w:after="20" w:line="252" w:lineRule="auto"/>
+        <w:tabs>
+          <w:tab w:val="right" w:pos="10469"/>
+        </w:tabs>
+        <w:spacing w:before="80" w:after="30" w:line="252" w:lineRule="auto"/>
       </w:pPr>
       <w:r>
         <w:rPr>
           <w:rFonts w:ascii="Calibri" w:eastAsia="Calibri" w:hAnsi="Calibri"/>
           <w:b/>
-          <w:color w:val="1E1E1E"/>
+          <w:color w:val="111827"/>
+          <w:sz w:val="20"/>
+        </w:rPr>
+        <w:t>Universitas Bina Bangsa</w:t>
+      </w:r>
+      <w:r>
+        <w:rPr>
+          <w:rFonts w:ascii="Calibri" w:eastAsia="Calibri" w:hAnsi="Calibri"/>
+          <w:color w:val="4B5563"/>
+          <w:sz w:val="19"/>
+        </w:rPr>
+        <w:t xml:space="preserve">  —  </w:t>
+      </w:r>
+      <w:r>
+        <w:rPr>
+          <w:rFonts w:ascii="Calibri" w:eastAsia="Calibri" w:hAnsi="Calibri"/>
+          <w:i/>
+          <w:color w:val="1F2937"/>
           <w:sz w:val="19"/>
         </w:rPr>
         <w:t>S1 Pendidikan Teknologi Informasi</w:t>
@@ -458,32 +564,24 @@
         <w:rPr>
           <w:rFonts w:ascii="Calibri" w:eastAsia="Calibri" w:hAnsi="Calibri"/>
           <w:b/>
-          <w:color w:val="18416E"/>
-          <w:sz w:val="19"/>
-        </w:rPr>
-        <w:t xml:space="preserve"> | Universitas Bina Bangsa, Serang</w:t>
-      </w:r>
-      <w:r>
-        <w:rPr>
-          <w:rFonts w:ascii="Calibri" w:eastAsia="Calibri" w:hAnsi="Calibri"/>
-          <w:i/>
-          <w:color w:val="5A5A5A"/>
+          <w:color w:val="1F2937"/>
           <w:sz w:val="18"/>
         </w:rPr>
-        <w:t xml:space="preserve"> — 2020 – 2024</w:t>
+        <w:tab/>
+        <w:t>2020 – 2024</w:t>
       </w:r>
     </w:p>
     <w:p>
       <w:pPr>
         <w:keepLines/>
-        <w:spacing w:after="30" w:line="252" w:lineRule="auto"/>
+        <w:spacing w:after="44" w:line="269" w:lineRule="auto"/>
         <w:ind w:left="259"/>
       </w:pPr>
       <w:r>
         <w:rPr>
           <w:rFonts w:ascii="Calibri" w:eastAsia="Calibri" w:hAnsi="Calibri"/>
           <w:b/>
-          <w:color w:val="18416E"/>
+          <w:color w:val="111827"/>
           <w:sz w:val="19"/>
         </w:rPr>
         <w:t xml:space="preserve">•  </w:t>
@@ -491,23 +589,131 @@
       <w:r>
         <w:rPr>
           <w:rFonts w:ascii="Calibri" w:eastAsia="Calibri" w:hAnsi="Calibri"/>
-          <w:color w:val="1E1E1E"/>
+          <w:color w:val="1F2937"/>
           <w:sz w:val="19"/>
         </w:rPr>
-        <w:t>IPK 3,96 / 4,00 — Lulusan Terbaik Program Studi (Yudisium 2024).</w:t>
+        <w:t>IPK 3,96 / 4,00 — Lulusan Terbaik Program Studi (Yudisium Juni 2024).</w:t>
+      </w:r>
+    </w:p>
+    <w:p>
+      <w:pPr>
+        <w:keepNext/>
+        <w:tabs>
+          <w:tab w:val="right" w:pos="10469"/>
+        </w:tabs>
+        <w:spacing w:before="80" w:after="30" w:line="252" w:lineRule="auto"/>
+      </w:pPr>
+      <w:r>
+        <w:rPr>
+          <w:rFonts w:ascii="Calibri" w:eastAsia="Calibri" w:hAnsi="Calibri"/>
+          <w:b/>
+          <w:color w:val="111827"/>
+          <w:sz w:val="20"/>
+        </w:rPr>
+        <w:t>SMK Negeri 1 Pandeglang</w:t>
+      </w:r>
+      <w:r>
+        <w:rPr>
+          <w:rFonts w:ascii="Calibri" w:eastAsia="Calibri" w:hAnsi="Calibri"/>
+          <w:color w:val="4B5563"/>
+          <w:sz w:val="19"/>
+        </w:rPr>
+        <w:t xml:space="preserve">  —  </w:t>
+      </w:r>
+      <w:r>
+        <w:rPr>
+          <w:rFonts w:ascii="Calibri" w:eastAsia="Calibri" w:hAnsi="Calibri"/>
+          <w:i/>
+          <w:color w:val="1F2937"/>
+          <w:sz w:val="19"/>
+        </w:rPr>
+        <w:t>Teknik Komputer dan Jaringan (TKJ)</w:t>
+      </w:r>
+      <w:r>
+        <w:rPr>
+          <w:rFonts w:ascii="Calibri" w:eastAsia="Calibri" w:hAnsi="Calibri"/>
+          <w:b/>
+          <w:color w:val="1F2937"/>
+          <w:sz w:val="18"/>
+        </w:rPr>
+        <w:tab/>
+        <w:t>2017 – 2020</w:t>
+      </w:r>
+    </w:p>
+    <w:p>
+      <w:pPr>
+        <w:keepNext/>
+        <w:pBdr>
+          <w:bottom w:val="single" w:sz="8" w:space="2" w:color="1F2937"/>
+        </w:pBdr>
+        <w:spacing w:before="170" w:after="70" w:line="240" w:lineRule="auto"/>
+      </w:pPr>
+      <w:r>
+        <w:rPr>
+          <w:rFonts w:ascii="Calibri" w:eastAsia="Calibri" w:hAnsi="Calibri"/>
+          <w:b/>
+          <w:color w:val="111827"/>
+          <w:sz w:val="21"/>
+        </w:rPr>
+        <w:t>PORTOFOLIO PROYEK TERPILIH</w:t>
+      </w:r>
+    </w:p>
+    <w:p>
+      <w:pPr>
+        <w:keepNext/>
+        <w:tabs>
+          <w:tab w:val="right" w:pos="10469"/>
+        </w:tabs>
+        <w:spacing w:before="80" w:after="30" w:line="252" w:lineRule="auto"/>
+      </w:pPr>
+      <w:r>
+        <w:rPr>
+          <w:rFonts w:ascii="Calibri" w:eastAsia="Calibri" w:hAnsi="Calibri"/>
+          <w:b/>
+          <w:color w:val="111827"/>
+          <w:sz w:val="20"/>
+        </w:rPr>
+        <w:t>AR Book — Dasar Komputer</w:t>
+      </w:r>
+      <w:r>
+        <w:rPr>
+          <w:rFonts w:ascii="Calibri" w:eastAsia="Calibri" w:hAnsi="Calibri"/>
+          <w:color w:val="4B5563"/>
+          <w:sz w:val="19"/>
+        </w:rPr>
+        <w:t xml:space="preserve">  —  </w:t>
+      </w:r>
+      <w:r>
+        <w:rPr>
+          <w:rFonts w:ascii="Calibri" w:eastAsia="Calibri" w:hAnsi="Calibri"/>
+          <w:i/>
+          <w:color w:val="1F2937"/>
+          <w:sz w:val="19"/>
+        </w:rPr>
+        <w:t>Unity 3D, C#, Vuforia (Android)</w:t>
+      </w:r>
+      <w:r>
+        <w:rPr>
+          <w:rFonts w:ascii="Calibri" w:eastAsia="Calibri" w:hAnsi="Calibri"/>
+          <w:b/>
+          <w:color w:val="1F2937"/>
+          <w:sz w:val="18"/>
+        </w:rPr>
+        <w:tab/>
+        <w:t>2024</w:t>
       </w:r>
     </w:p>
     <w:p>
       <w:pPr>
         <w:keepLines/>
-        <w:spacing w:after="30" w:line="252" w:lineRule="auto"/>
+        <w:spacing w:after="44" w:line="269" w:lineRule="auto"/>
         <w:ind w:left="259"/>
       </w:pPr>
       <w:r>
         <w:rPr>
           <w:rFonts w:ascii="Calibri" w:eastAsia="Calibri" w:hAnsi="Calibri"/>
           <w:b/>
-          <w:color w:val="18416E"/>
+          <w:color w:val="111827"/>
           <w:sz w:val="19"/>
         </w:rPr>
         <w:t xml:space="preserve">•  </w:t>
@@ -515,72 +721,68 @@
       <w:r>
         <w:rPr>
           <w:rFonts w:ascii="Calibri" w:eastAsia="Calibri" w:hAnsi="Calibri"/>
-          <w:color w:val="1E1E1E"/>
+          <w:color w:val="1F2937"/>
           <w:sz w:val="19"/>
         </w:rPr>
-        <w:t>Fokus keahlian: Game Edukasi, Pengembangan Aplikasi, dan Perancangan Learning Management System (LMS).</w:t>
+        <w:t>Aplikasi Android AR edukatif yang menampilkan visualisasi 3D komponen komputer secara interaktif saat memindai buku fisik.</w:t>
       </w:r>
     </w:p>
     <w:p>
       <w:pPr>
-        <w:spacing w:before="50" w:after="20" w:line="252" w:lineRule="auto"/>
+        <w:keepNext/>
+        <w:tabs>
+          <w:tab w:val="right" w:pos="10469"/>
+        </w:tabs>
+        <w:spacing w:before="80" w:after="30" w:line="252" w:lineRule="auto"/>
       </w:pPr>
       <w:r>
         <w:rPr>
           <w:rFonts w:ascii="Calibri" w:eastAsia="Calibri" w:hAnsi="Calibri"/>
           <w:b/>
-          <w:color w:val="1E1E1E"/>
+          <w:color w:val="111827"/>
+          <w:sz w:val="20"/>
+        </w:rPr>
+        <w:t>Game Petualangan Barudak</w:t>
+      </w:r>
+      <w:r>
+        <w:rPr>
+          <w:rFonts w:ascii="Calibri" w:eastAsia="Calibri" w:hAnsi="Calibri"/>
+          <w:color w:val="4B5563"/>
           <w:sz w:val="19"/>
         </w:rPr>
-        <w:t>Teknik Komputer dan Jaringan</w:t>
+        <w:t xml:space="preserve">  —  </w:t>
+      </w:r>
+      <w:r>
+        <w:rPr>
+          <w:rFonts w:ascii="Calibri" w:eastAsia="Calibri" w:hAnsi="Calibri"/>
+          <w:i/>
+          <w:color w:val="1F2937"/>
+          <w:sz w:val="19"/>
+        </w:rPr>
+        <w:t>Unity 3D, C#, Game Edukasi</w:t>
       </w:r>
       <w:r>
         <w:rPr>
           <w:rFonts w:ascii="Calibri" w:eastAsia="Calibri" w:hAnsi="Calibri"/>
           <w:b/>
-          <w:color w:val="18416E"/>
-          <w:sz w:val="19"/>
-        </w:rPr>
-        <w:t xml:space="preserve"> | SMKN 1 Pandeglang</w:t>
-      </w:r>
-      <w:r>
-        <w:rPr>
-          <w:rFonts w:ascii="Calibri" w:eastAsia="Calibri" w:hAnsi="Calibri"/>
-          <w:i/>
-          <w:color w:val="5A5A5A"/>
+          <w:color w:val="1F2937"/>
           <w:sz w:val="18"/>
         </w:rPr>
-        <w:t xml:space="preserve"> — 2017 – 2020</w:t>
+        <w:tab/>
+        <w:t>2024</w:t>
       </w:r>
     </w:p>
     <w:p>
       <w:pPr>
-        <w:keepNext/>
-        <w:pBdr>
-          <w:bottom w:val="single" w:sz="6" w:space="1" w:color="18416E"/>
-        </w:pBdr>
-        <w:spacing w:before="110" w:after="50" w:line="240" w:lineRule="auto"/>
-      </w:pPr>
-      <w:r>
-        <w:rPr>
-          <w:rFonts w:ascii="Calibri" w:eastAsia="Calibri" w:hAnsi="Calibri"/>
-          <w:b/>
-          <w:color w:val="18416E"/>
-          <w:sz w:val="21"/>
-        </w:rPr>
-        <w:t>PROYEK PILIHAN</w:t>
-      </w:r>
-    </w:p>
-    <w:p>
-      <w:pPr>
-        <w:spacing w:after="30" w:line="252" w:lineRule="auto"/>
+        <w:keepLines/>
+        <w:spacing w:after="44" w:line="269" w:lineRule="auto"/>
         <w:ind w:left="259"/>
       </w:pPr>
       <w:r>
         <w:rPr>
           <w:rFonts w:ascii="Calibri" w:eastAsia="Calibri" w:hAnsi="Calibri"/>
           <w:b/>
-          <w:color w:val="18416E"/>
+          <w:color w:val="111827"/>
           <w:sz w:val="19"/>
         </w:rPr>
         <w:t xml:space="preserve">•  </w:t>
@@ -588,40 +790,68 @@
       <w:r>
         <w:rPr>
           <w:rFonts w:ascii="Calibri" w:eastAsia="Calibri" w:hAnsi="Calibri"/>
-          <w:b/>
-          <w:color w:val="1E1E1E"/>
+          <w:color w:val="1F2937"/>
           <w:sz w:val="19"/>
         </w:rPr>
-        <w:t xml:space="preserve">AR Book - Dasar Komputer </w:t>
+        <w:t>Game petualangan edukatif pengenalan budaya Banten dan konsep bangun ruang matematika dengan visualisasi 3D dan kuis.</w:t>
+      </w:r>
+    </w:p>
+    <w:p>
+      <w:pPr>
+        <w:keepNext/>
+        <w:tabs>
+          <w:tab w:val="right" w:pos="10469"/>
+        </w:tabs>
+        <w:spacing w:before="80" w:after="30" w:line="252" w:lineRule="auto"/>
+      </w:pPr>
+      <w:r>
+        <w:rPr>
+          <w:rFonts w:ascii="Calibri" w:eastAsia="Calibri" w:hAnsi="Calibri"/>
+          <w:b/>
+          <w:color w:val="111827"/>
+          <w:sz w:val="20"/>
+        </w:rPr>
+        <w:t>42 Berita Kita &amp; E-Commerce</w:t>
+      </w:r>
+      <w:r>
+        <w:rPr>
+          <w:rFonts w:ascii="Calibri" w:eastAsia="Calibri" w:hAnsi="Calibri"/>
+          <w:color w:val="4B5563"/>
+          <w:sz w:val="19"/>
+        </w:rPr>
+        <w:t xml:space="preserve">  —  </w:t>
       </w:r>
       <w:r>
         <w:rPr>
           <w:rFonts w:ascii="Calibri" w:eastAsia="Calibri" w:hAnsi="Calibri"/>
           <w:i/>
-          <w:color w:val="18416E"/>
-          <w:sz w:val="18"/>
+          <w:color w:val="1F2937"/>
+          <w:sz w:val="19"/>
         </w:rPr>
-        <w:t xml:space="preserve">(Unity 3D, C#, Vuforia): </w:t>
+        <w:t>PHP, JavaScript, MySQL, CMS</w:t>
       </w:r>
       <w:r>
         <w:rPr>
           <w:rFonts w:ascii="Calibri" w:eastAsia="Calibri" w:hAnsi="Calibri"/>
-          <w:color w:val="1E1E1E"/>
+          <w:b/>
+          <w:color w:val="1F2937"/>
           <w:sz w:val="18"/>
         </w:rPr>
-        <w:t>Aplikasi Android AR edukatif yang menampilkan visualisasi 3D perangkat keras &amp; lunak komputer secara interaktif saat memindai buku.</w:t>
+        <w:tab/>
+        <w:t>2023 – 2024</w:t>
       </w:r>
     </w:p>
     <w:p>
       <w:pPr>
-        <w:spacing w:after="30" w:line="252" w:lineRule="auto"/>
+        <w:keepLines/>
+        <w:spacing w:after="44" w:line="269" w:lineRule="auto"/>
         <w:ind w:left="259"/>
       </w:pPr>
       <w:r>
         <w:rPr>
           <w:rFonts w:ascii="Calibri" w:eastAsia="Calibri" w:hAnsi="Calibri"/>
           <w:b/>
-          <w:color w:val="18416E"/>
+          <w:color w:val="111827"/>
           <w:sz w:val="19"/>
         </w:rPr>
         <w:t xml:space="preserve">•  </w:t>
@@ -629,158 +859,125 @@
       <w:r>
         <w:rPr>
           <w:rFonts w:ascii="Calibri" w:eastAsia="Calibri" w:hAnsi="Calibri"/>
-          <w:b/>
-          <w:color w:val="1E1E1E"/>
+          <w:color w:val="1F2937"/>
           <w:sz w:val="19"/>
         </w:rPr>
-        <w:t xml:space="preserve">Petualangan Barudak </w:t>
-      </w:r>
-      <w:r>
-        <w:rPr>
-          <w:rFonts w:ascii="Calibri" w:eastAsia="Calibri" w:hAnsi="Calibri"/>
-          <w:i/>
-          <w:color w:val="18416E"/>
-          <w:sz w:val="18"/>
-        </w:rPr>
-        <w:t xml:space="preserve">(Unity, C#, Game 3D): </w:t>
-      </w:r>
-      <w:r>
-        <w:rPr>
-          <w:rFonts w:ascii="Calibri" w:eastAsia="Calibri" w:hAnsi="Calibri"/>
-          <w:color w:val="1E1E1E"/>
-          <w:sz w:val="18"/>
-        </w:rPr>
-        <w:t>Game edukasi eksplorasi Provinsi Banten dengan kuis dan visualisasi bangunan nyata untuk pembelajaran bangun ruang.</w:t>
+        <w:t>Website portal berita dinamis dan platform e-commerce dengan sistem manajemen konten, katalog produk, stok, dan checkout.</w:t>
       </w:r>
     </w:p>
     <w:p>
       <w:pPr>
-        <w:spacing w:after="30" w:line="252" w:lineRule="auto"/>
+        <w:keepNext/>
+        <w:pBdr>
+          <w:bottom w:val="single" w:sz="8" w:space="2" w:color="1F2937"/>
+        </w:pBdr>
+        <w:spacing w:before="170" w:after="70" w:line="240" w:lineRule="auto"/>
+      </w:pPr>
+      <w:r>
+        <w:rPr>
+          <w:rFonts w:ascii="Calibri" w:eastAsia="Calibri" w:hAnsi="Calibri"/>
+          <w:b/>
+          <w:color w:val="111827"/>
+          <w:sz w:val="21"/>
+        </w:rPr>
+        <w:t>KEAHLIAN &amp; INFORMASI TAMBAHAN</w:t>
+      </w:r>
+    </w:p>
+    <w:p>
+      <w:pPr>
+        <w:spacing w:after="50" w:line="269" w:lineRule="auto"/>
         <w:ind w:left="259"/>
       </w:pPr>
       <w:r>
         <w:rPr>
           <w:rFonts w:ascii="Calibri" w:eastAsia="Calibri" w:hAnsi="Calibri"/>
           <w:b/>
-          <w:color w:val="18416E"/>
+          <w:color w:val="111827"/>
           <w:sz w:val="19"/>
         </w:rPr>
-        <w:t xml:space="preserve">•  </w:t>
+        <w:t xml:space="preserve">•  Operasional &amp; Tools: </w:t>
       </w:r>
       <w:r>
         <w:rPr>
           <w:rFonts w:ascii="Calibri" w:eastAsia="Calibri" w:hAnsi="Calibri"/>
-          <w:b/>
-          <w:color w:val="1E1E1E"/>
+          <w:color w:val="1F2937"/>
           <w:sz w:val="19"/>
         </w:rPr>
-        <w:t xml:space="preserve">42 Berita Kita &amp; E-Commerce </w:t>
-      </w:r>
-      <w:r>
-        <w:rPr>
-          <w:rFonts w:ascii="Calibri" w:eastAsia="Calibri" w:hAnsi="Calibri"/>
-          <w:i/>
-          <w:color w:val="18416E"/>
-          <w:sz w:val="18"/>
-        </w:rPr>
-        <w:t xml:space="preserve">(Web, PHP/JS, CMS, MySQL): </w:t>
-      </w:r>
-      <w:r>
-        <w:rPr>
-          <w:rFonts w:ascii="Calibri" w:eastAsia="Calibri" w:hAnsi="Calibri"/>
-          <w:color w:val="1E1E1E"/>
-          <w:sz w:val="18"/>
-        </w:rPr>
-        <w:t>Portal berita dinamis &amp; platform toko daring dengan katalog produk, filter kategori, keranjang belanja, dan manajemen stok.</w:t>
+        <w:t>UIM, WOC, ROC, C4, Microsoft Excel, Microsoft Word, Google Workspace, Data Reconciliation.</w:t>
       </w:r>
     </w:p>
     <w:p>
       <w:pPr>
-        <w:keepNext/>
-        <w:pBdr>
-          <w:bottom w:val="single" w:sz="6" w:space="1" w:color="18416E"/>
-        </w:pBdr>
-        <w:spacing w:before="110" w:after="50" w:line="240" w:lineRule="auto"/>
+        <w:spacing w:after="50" w:line="269" w:lineRule="auto"/>
+        <w:ind w:left="259"/>
       </w:pPr>
       <w:r>
         <w:rPr>
           <w:rFonts w:ascii="Calibri" w:eastAsia="Calibri" w:hAnsi="Calibri"/>
           <w:b/>
-          <w:color w:val="18416E"/>
-          <w:sz w:val="21"/>
+          <w:color w:val="111827"/>
+          <w:sz w:val="19"/>
         </w:rPr>
-        <w:t>KEAHLIAN TEKNIS &amp; ORGANISASI</w:t>
+        <w:t xml:space="preserve">•  Software &amp; Web: </w:t>
+      </w:r>
+      <w:r>
+        <w:rPr>
+          <w:rFonts w:ascii="Calibri" w:eastAsia="Calibri" w:hAnsi="Calibri"/>
+          <w:color w:val="1F2937"/>
+          <w:sz w:val="19"/>
+        </w:rPr>
+        <w:t>Unity 3D, C#, Vuforia (AR), HTML5/CSS3, JavaScript/TypeScript, React, PHP, MySQL, WordPress, Git.</w:t>
       </w:r>
     </w:p>
     <w:p>
       <w:pPr>
-        <w:spacing w:after="30" w:line="252" w:lineRule="auto"/>
+        <w:spacing w:after="50" w:line="269" w:lineRule="auto"/>
+        <w:ind w:left="259"/>
       </w:pPr>
       <w:r>
         <w:rPr>
           <w:rFonts w:ascii="Calibri" w:eastAsia="Calibri" w:hAnsi="Calibri"/>
           <w:b/>
-          <w:color w:val="1E1E1E"/>
-          <w:sz w:val="18"/>
+          <w:color w:val="111827"/>
+          <w:sz w:val="19"/>
         </w:rPr>
-        <w:t xml:space="preserve">Operasional &amp; Data: </w:t>
+        <w:t xml:space="preserve">•  Organisasi &amp; Kontribusi: </w:t>
       </w:r>
       <w:r>
         <w:rPr>
           <w:rFonts w:ascii="Calibri" w:eastAsia="Calibri" w:hAnsi="Calibri"/>
-          <w:color w:val="1E1E1E"/>
-          <w:sz w:val="18"/>
+          <w:color w:val="1F2937"/>
+          <w:sz w:val="19"/>
         </w:rPr>
-        <w:t>Rekonsiliasi Data, Alur Order &amp; Tiket (UIM, WOC, ROC, C4), Administrasi &amp; Laporan Teknis, MS Excel.</w:t>
+        <w:t>Wakil Ketua HIMA PTI (2022–2023) | Kontributor Inovasi Teknologi Pendidikan Indonesia (2025–2026).</w:t>
       </w:r>
     </w:p>
     <w:p>
       <w:pPr>
-        <w:spacing w:after="30" w:line="252" w:lineRule="auto"/>
+        <w:spacing w:after="50" w:line="269" w:lineRule="auto"/>
+        <w:ind w:left="259"/>
       </w:pPr>
       <w:r>
         <w:rPr>
           <w:rFonts w:ascii="Calibri" w:eastAsia="Calibri" w:hAnsi="Calibri"/>
           <w:b/>
-          <w:color w:val="1E1E1E"/>
-          <w:sz w:val="18"/>
+          <w:color w:val="111827"/>
+          <w:sz w:val="19"/>
         </w:rPr>
-        <w:t xml:space="preserve">Software &amp; Web: </w:t>
+        <w:t xml:space="preserve">•  Bahasa &amp; Skor: </w:t>
       </w:r>
       <w:r>
         <w:rPr>
           <w:rFonts w:ascii="Calibri" w:eastAsia="Calibri" w:hAnsi="Calibri"/>
-          <w:color w:val="1E1E1E"/>
-          <w:sz w:val="18"/>
+          <w:color w:val="1F2937"/>
+          <w:sz w:val="19"/>
         </w:rPr>
-        <w:t>Unity 3D, C#, Vuforia (AR), HTML5/CSS3, JavaScript/TypeScript, React, CMS/WordPress, Firebase, Git/GitHub.</w:t>
-      </w:r>
-    </w:p>
-    <w:p>
-      <w:pPr>
-        <w:spacing w:after="30" w:line="252" w:lineRule="auto"/>
-      </w:pPr>
-      <w:r>
-        <w:rPr>
-          <w:rFonts w:ascii="Calibri" w:eastAsia="Calibri" w:hAnsi="Calibri"/>
-          <w:b/>
-          <w:color w:val="1E1E1E"/>
-          <w:sz w:val="18"/>
-        </w:rPr>
-        <w:t xml:space="preserve">Organisasi &amp; Kontribusi: </w:t>
-      </w:r>
-      <w:r>
-        <w:rPr>
-          <w:rFonts w:ascii="Calibri" w:eastAsia="Calibri" w:hAnsi="Calibri"/>
-          <w:color w:val="1E1E1E"/>
-          <w:sz w:val="18"/>
-        </w:rPr>
-        <w:t>Wakil Ketua Himpunan Mahasiswa PTI (2022–2023) | Kontributor Inovasi Teknologi Pendidikan Indonesia (2025–2026) | TOEFL: 550.</w:t>
+        <w:t>Bahasa Indonesia (Penutur Asli) | Bahasa Inggris (Skor TOEFL: 550 - Pusat Bahasa UNIBA).</w:t>
       </w:r>
     </w:p>
     <w:sectPr>
       <w:pgSz w:w="11909" w:h="16834"/>
-      <w:pgMar w:top="648" w:right="691" w:bottom="648" w:left="691" w:header="720" w:footer="720" w:gutter="0"/>
+      <w:pgMar w:top="691" w:right="720" w:bottom="691" w:left="720" w:header="720" w:footer="720" w:gutter="0"/>
       <w:cols w:space="720"/>
       <w:docGrid w:linePitch="360"/>
     </w:sectPr>
@@ -961,31 +1158,31 @@
       </w:rPr>
     </w:lvl>
   </w:abstractNum>
-  <w:num w:numId="1" w16cid:durableId="1911428082">
+  <w:num w:numId="1" w16cid:durableId="897059309">
     <w:abstractNumId w:val="8"/>
   </w:num>
-  <w:num w:numId="2" w16cid:durableId="1911110186">
+  <w:num w:numId="2" w16cid:durableId="88627247">
     <w:abstractNumId w:val="6"/>
   </w:num>
-  <w:num w:numId="3" w16cid:durableId="1908606368">
+  <w:num w:numId="3" w16cid:durableId="337998378">
     <w:abstractNumId w:val="5"/>
   </w:num>
-  <w:num w:numId="4" w16cid:durableId="30889428">
+  <w:num w:numId="4" w16cid:durableId="1627586975">
     <w:abstractNumId w:val="4"/>
   </w:num>
-  <w:num w:numId="5" w16cid:durableId="1651396709">
+  <w:num w:numId="5" w16cid:durableId="775296242">
     <w:abstractNumId w:val="7"/>
   </w:num>
-  <w:num w:numId="6" w16cid:durableId="1389647318">
+  <w:num w:numId="6" w16cid:durableId="1476947020">
     <w:abstractNumId w:val="3"/>
   </w:num>
-  <w:num w:numId="7" w16cid:durableId="523253833">
+  <w:num w:numId="7" w16cid:durableId="371273091">
     <w:abstractNumId w:val="2"/>
   </w:num>
-  <w:num w:numId="8" w16cid:durableId="1184200243">
+  <w:num w:numId="8" w16cid:durableId="91752402">
     <w:abstractNumId w:val="1"/>
   </w:num>
-  <w:num w:numId="9" w16cid:durableId="246889870">
+  <w:num w:numId="9" w16cid:durableId="967932928">
     <w:abstractNumId w:val="0"/>
   </w:num>
 </w:numbering>

</xml_diff>